<commit_message>
Fix Chinese chart typography
Co-authored-by: kid2226 <kid2226@users.noreply.github.com>
</commit_message>
<xml_diff>
--- a/output/中国房地产市场发展研究报告_2026-2030.docx
+++ b/output/中国房地产市场发展研究报告_2026-2030.docx
@@ -3497,7 +3497,7 @@
       <w:r>
         <w:drawing>
           <wp:inline xmlns:a="http://schemas.openxmlformats.org/drawingml/2006/main" xmlns:pic="http://schemas.openxmlformats.org/drawingml/2006/picture">
-            <wp:extent cx="5806440" cy="3049913"/>
+            <wp:extent cx="5806440" cy="3048220"/>
             <wp:docPr id="1" name="Picture 1"/>
             <wp:cNvGraphicFramePr>
               <a:graphicFrameLocks noChangeAspect="1"/>
@@ -3518,7 +3518,7 @@
                   <pic:spPr>
                     <a:xfrm>
                       <a:off x="0" y="0"/>
-                      <a:ext cx="5806440" cy="3049913"/>
+                      <a:ext cx="5806440" cy="3048220"/>
                     </a:xfrm>
                     <a:prstGeom prst="rect"/>
                   </pic:spPr>
@@ -3571,7 +3571,7 @@
       <w:r>
         <w:drawing>
           <wp:inline xmlns:a="http://schemas.openxmlformats.org/drawingml/2006/main" xmlns:pic="http://schemas.openxmlformats.org/drawingml/2006/picture">
-            <wp:extent cx="5806440" cy="3046530"/>
+            <wp:extent cx="5806440" cy="3043154"/>
             <wp:docPr id="2" name="Picture 2"/>
             <wp:cNvGraphicFramePr>
               <a:graphicFrameLocks noChangeAspect="1"/>
@@ -3592,7 +3592,7 @@
                   <pic:spPr>
                     <a:xfrm>
                       <a:off x="0" y="0"/>
-                      <a:ext cx="5806440" cy="3046530"/>
+                      <a:ext cx="5806440" cy="3043154"/>
                     </a:xfrm>
                     <a:prstGeom prst="rect"/>
                   </pic:spPr>
@@ -7430,7 +7430,7 @@
       <w:r>
         <w:drawing>
           <wp:inline xmlns:a="http://schemas.openxmlformats.org/drawingml/2006/main" xmlns:pic="http://schemas.openxmlformats.org/drawingml/2006/picture">
-            <wp:extent cx="5806440" cy="3329928"/>
+            <wp:extent cx="5806440" cy="3324863"/>
             <wp:docPr id="3" name="Picture 3"/>
             <wp:cNvGraphicFramePr>
               <a:graphicFrameLocks noChangeAspect="1"/>
@@ -7451,7 +7451,7 @@
                   <pic:spPr>
                     <a:xfrm>
                       <a:off x="0" y="0"/>
-                      <a:ext cx="5806440" cy="3329928"/>
+                      <a:ext cx="5806440" cy="3324863"/>
                     </a:xfrm>
                     <a:prstGeom prst="rect"/>
                   </pic:spPr>
@@ -7499,7 +7499,7 @@
       <w:r>
         <w:drawing>
           <wp:inline xmlns:a="http://schemas.openxmlformats.org/drawingml/2006/main" xmlns:pic="http://schemas.openxmlformats.org/drawingml/2006/picture">
-            <wp:extent cx="5806440" cy="3117379"/>
+            <wp:extent cx="5806440" cy="3114393"/>
             <wp:docPr id="4" name="Picture 4"/>
             <wp:cNvGraphicFramePr>
               <a:graphicFrameLocks noChangeAspect="1"/>
@@ -7520,7 +7520,7 @@
                   <pic:spPr>
                     <a:xfrm>
                       <a:off x="0" y="0"/>
-                      <a:ext cx="5806440" cy="3117379"/>
+                      <a:ext cx="5806440" cy="3114393"/>
                     </a:xfrm>
                     <a:prstGeom prst="rect"/>
                   </pic:spPr>
@@ -7560,7 +7560,7 @@
       <w:r>
         <w:drawing>
           <wp:inline xmlns:a="http://schemas.openxmlformats.org/drawingml/2006/main" xmlns:pic="http://schemas.openxmlformats.org/drawingml/2006/picture">
-            <wp:extent cx="5806440" cy="3105994"/>
+            <wp:extent cx="5806440" cy="3106220"/>
             <wp:docPr id="5" name="Picture 5"/>
             <wp:cNvGraphicFramePr>
               <a:graphicFrameLocks noChangeAspect="1"/>
@@ -7581,7 +7581,7 @@
                   <pic:spPr>
                     <a:xfrm>
                       <a:off x="0" y="0"/>
-                      <a:ext cx="5806440" cy="3105994"/>
+                      <a:ext cx="5806440" cy="3106220"/>
                     </a:xfrm>
                     <a:prstGeom prst="rect"/>
                   </pic:spPr>

</xml_diff>

<commit_message>
Incorporate final market research findings
Co-authored-by: kid2226 <kid2226@users.noreply.github.com>
</commit_message>
<xml_diff>
--- a/output/中国房地产市场发展研究报告_2026-2030.docx
+++ b/output/中国房地产市场发展研究报告_2026-2030.docx
@@ -288,7 +288,7 @@
         <w:t>调整尚未结束，但已进入后半程。</w:t>
       </w:r>
       <w:r>
-        <w:t>2025年房地产开发投资同比下降17.2%，新建商品房销售面积下降8.7%；2026年1—6月投资、销售面积和新开工又分别下降18.0%、11.6%和23.4%。供给收缩有利于未来再平衡，但销售弱于库存去化意味着价格仍需时间发现底部。</w:t>
+        <w:t>2025年房地产开发投资同比下降17.2%，新建商品房销售面积下降8.7%；2026年1—7月投资、销售面积和新开工又分别下降19.2%、11.8%和24.0%。供给收缩有利于未来再平衡，但销售弱于库存去化意味着价格仍需时间发现底部。</w:t>
       </w:r>
     </w:p>
     <w:p>
@@ -330,10 +330,10 @@
         <w:rPr>
           <w:b/>
         </w:rPr>
-        <w:t>四城排序：上海≈杭州＞深圳＞北京（基准情景的价格弹性），但风险调整后上海最均衡。</w:t>
+        <w:t>四城风险调整韧性：上海＞北京≈深圳＞杭州；上行弹性则深圳、杭州更高。</w:t>
       </w:r>
       <w:r>
-        <w:t>上海兼具全球城市产业、人口规模和2026年新房相对强势；杭州人口与数字经济增长突出但新房供应结构抬高指数；深圳人口增量最大、周期弹性也最大；北京资源稀缺但人口基本持平、二手房调整更深。</w:t>
+        <w:t>上海兼具全球城市产业、人口规模和较强二手流动性；北京资源稀缺但人口基本持平、远郊库存压制上限；深圳人口增量最大但租金收益率最低、波动更高；杭州数字经济强，但潜在供应和新房替代使二手调整可能更久。</w:t>
       </w:r>
     </w:p>
     <w:p>
@@ -3561,7 +3561,7 @@
     </w:p>
     <w:p>
       <w:r>
-        <w:t>2025年全国房地产开发投资8.28万亿元，同比下降17.2%；新建商品房销售面积8.81亿平方米，同比下降8.7%，销售额8.39万亿元，下降12.6%；年末商品房待售面积7.66亿平方米，同比增长1.6%。2026年上半年，投资与销售继续收缩，说明2024年以来的宽松政策改善了局部城市成交，但尚未改变全国总量趋势。</w:t>
+        <w:t>2025年全国房地产开发投资8.28万亿元，同比下降17.2%；新建商品房销售面积8.81亿平方米，同比下降8.7%，销售额8.39万亿元，下降12.6%；年末商品房待售面积7.66亿平方米，同比增长1.6%。2026年1—7月开发投资4.30万亿元、销售面积4.50亿平方米、销售额4.27万亿元，同比分别下降19.2%、11.8%和13.1%；房企到位资金下降20.3%，说明宽松政策改善了局部城市成交，但尚未改变全国总量趋势。</w:t>
       </w:r>
     </w:p>
     <w:p>
@@ -3613,7 +3613,7 @@
           <w:color w:val="1D2939"/>
           <w:sz w:val="18"/>
         </w:rPr>
-        <w:t>图2　2026年1—6月全国房地产主要指标同比变化</w:t>
+        <w:t>图2　2026年1—7月全国房地产主要指标同比变化</w:t>
       </w:r>
     </w:p>
     <w:p>
@@ -3622,7 +3622,7 @@
         <w:jc w:val="center"/>
       </w:pPr>
       <w:r>
-        <w:t>资料来源：国家统计局《2026年1—6月份全国房地产市场基本情况》。</w:t>
+        <w:t>资料来源：国家统计局2026年1—7月房地产数据（2026年8月17日发布；官方内容转载页见附录）。</w:t>
       </w:r>
     </w:p>
     <w:tbl>
@@ -3668,7 +3668,7 @@
               <w:rPr>
                 <w:b w:val="0"/>
               </w:rPr>
-              <w:t>新开工下降23.4%不是纯粹利空。短期它反映开发商资金与信心不足；中期则意味着新增供给显著减少，是库存消化和价格稳定的必要条件。真正的转折信号应是“销售降幅收窄 + 待售库存持续下降 + 二手挂牌周期缩短”，而不是单看新开工。</w:t>
+              <w:t>新开工下降24.0%不是纯粹利空。短期它反映开发商资金与信心不足；中期则意味着新增供给显著减少，是库存消化和价格稳定的必要条件。真正的转折信号应是“销售降幅收窄 + 待售库存持续下降 + 二手挂牌周期缩短”，而不是单看新开工。</w:t>
             </w:r>
           </w:p>
         </w:tc>
@@ -4588,7 +4588,7 @@
               <w:rPr>
                 <w:sz w:val="15"/>
               </w:rPr>
-              <w:t>日本（1985—约2005）</w:t>
+              <w:t>日本（1991Q2—2009Q2）</w:t>
             </w:r>
           </w:p>
         </w:tc>
@@ -4636,7 +4636,7 @@
               <w:rPr>
                 <w:sz w:val="15"/>
               </w:rPr>
-              <w:t>1991后土地与住宅长期下跌；东京实际住宅低点约为峰值1/3（特定指数）</w:t>
+              <w:t>达拉斯联储口径实际房价峰谷-47.3%、同期名义-49.0%</w:t>
             </w:r>
           </w:p>
         </w:tc>
@@ -4711,7 +4711,7 @@
               <w:rPr>
                 <w:sz w:val="15"/>
               </w:rPr>
-              <w:t>美国（1997—2012）</w:t>
+              <w:t>美国（2006Q4—2012Q2）</w:t>
             </w:r>
           </w:p>
         </w:tc>
@@ -4736,7 +4736,7 @@
               <w:rPr>
                 <w:sz w:val="15"/>
               </w:rPr>
-              <w:t>低利率、宽松承销、证券化、供给弹性</w:t>
+              <w:t>低利率、宽松承销、证券化、家庭加杠杆</w:t>
             </w:r>
           </w:p>
         </w:tc>
@@ -4761,7 +4761,7 @@
               <w:rPr>
                 <w:sz w:val="15"/>
               </w:rPr>
-              <w:t>2006见顶，Case-Shiller全国名义指数峰谷约-27%；止赎加剧下跌</w:t>
+              <w:t>达拉斯联储口径实际房价峰谷-27.0%、同期名义-18.9%</w:t>
             </w:r>
           </w:p>
         </w:tc>
@@ -4837,7 +4837,7 @@
               <w:rPr>
                 <w:sz w:val="15"/>
               </w:rPr>
-              <w:t>西班牙/爱尔兰（1997—2013）</w:t>
+              <w:t>西班牙/爱尔兰（2007—2014）</w:t>
             </w:r>
           </w:p>
         </w:tc>
@@ -4885,7 +4885,7 @@
               <w:rPr>
                 <w:sz w:val="15"/>
               </w:rPr>
-              <w:t>房价和建设活动大幅回撤；银行与主权风险互相强化</w:t>
+              <w:t>实际峰谷约-36.1%/-51.2%；银行与主权风险互相强化</w:t>
             </w:r>
           </w:p>
         </w:tc>
@@ -4960,7 +4960,7 @@
               <w:rPr>
                 <w:sz w:val="15"/>
               </w:rPr>
-              <w:t>德国（2010—2024）</w:t>
+              <w:t>德国（2021Q4—2024Q1）</w:t>
             </w:r>
           </w:p>
         </w:tc>
@@ -5010,7 +5010,7 @@
               <w:rPr>
                 <w:sz w:val="15"/>
               </w:rPr>
-              <w:t>2022后利率急升，名义价格温和下调、交易冻结，2024—2025趋稳</w:t>
+              <w:t>利率急升后实际峰谷约-22.1%、同期名义-11.4%</w:t>
             </w:r>
           </w:p>
         </w:tc>
@@ -5035,7 +5035,7 @@
               <w:rPr>
                 <w:sz w:val="15"/>
               </w:rPr>
-              <w:t>租赁市场深、长期固定融资缓冲系统风险</w:t>
+              <w:t>租赁市场深、长期融资缓冲系统风险</w:t>
             </w:r>
           </w:p>
         </w:tc>
@@ -5198,7 +5198,7 @@
         <w:pStyle w:val="CaptionSource"/>
       </w:pPr>
       <w:r>
-        <w:t>注：各国指数口径不同，表中峰谷幅度仅用于说明数量级，不做一一可比。日本“低点约峰值1/3”来自日本银行演讲所引大东京实际公寓指数；美国约-27%为Case-Shiller全国名义指数的常见峰谷估算。</w:t>
+        <w:t>注：峰谷采用达拉斯联储International House Price Database 2025Q4版实际房价序列（季调、2005=100，PCE平减）；不同于BIS的CPI平减和各国官方指数。新加坡等缺少同口径长序列者仅作制度比较，不做伪精确估算。</w:t>
       </w:r>
     </w:p>
     <w:p>
@@ -7618,6 +7618,550 @@
       <w:tblPr>
         <w:tblW w:type="auto" w:w="0"/>
         <w:jc w:val="center"/>
+        <w:tblLayout w:type="fixed"/>
+        <w:tblLook w:firstColumn="1" w:firstRow="1" w:lastColumn="0" w:lastRow="0" w:noHBand="0" w:noVBand="1" w:val="04A0"/>
+        <w:tblBorders>
+          <w:top w:val="single" w:sz="4" w:color="D0D5DD"/>
+          <w:left w:val="single" w:sz="4" w:color="D0D5DD"/>
+          <w:bottom w:val="single" w:sz="4" w:color="D0D5DD"/>
+          <w:right w:val="single" w:sz="4" w:color="D0D5DD"/>
+          <w:insideH w:val="single" w:sz="4" w:color="D0D5DD"/>
+          <w:insideV w:val="single" w:sz="4" w:color="D0D5DD"/>
+        </w:tblBorders>
+      </w:tblPr>
+      <w:tblGrid>
+        <w:gridCol w:w="2465"/>
+        <w:gridCol w:w="2465"/>
+        <w:gridCol w:w="2465"/>
+        <w:gridCol w:w="2465"/>
+      </w:tblGrid>
+      <w:tr>
+        <w:trPr>
+          <w:tblHeader w:val="true"/>
+        </w:trPr>
+        <w:tc>
+          <w:tcPr>
+            <w:tcW w:type="dxa" w:w="1417"/>
+            <w:shd w:fill="17365D"/>
+            <w:tcMar>
+              <w:top w:w="90" w:type="dxa"/>
+              <w:start w:w="100" w:type="dxa"/>
+              <w:bottom w:w="90" w:type="dxa"/>
+              <w:end w:w="100" w:type="dxa"/>
+            </w:tcMar>
+            <w:vAlign w:val="center"/>
+          </w:tcPr>
+          <w:p>
+            <w:pPr>
+              <w:jc w:val="center"/>
+            </w:pPr>
+            <w:r>
+              <w:rPr>
+                <w:b/>
+                <w:color w:val="FFFFFF"/>
+                <w:sz w:val="17"/>
+              </w:rPr>
+              <w:t>城市</w:t>
+            </w:r>
+          </w:p>
+        </w:tc>
+        <w:tc>
+          <w:tcPr>
+            <w:tcW w:type="dxa" w:w="2154"/>
+            <w:shd w:fill="17365D"/>
+            <w:tcMar>
+              <w:top w:w="90" w:type="dxa"/>
+              <w:start w:w="100" w:type="dxa"/>
+              <w:bottom w:w="90" w:type="dxa"/>
+              <w:end w:w="100" w:type="dxa"/>
+            </w:tcMar>
+            <w:vAlign w:val="center"/>
+          </w:tcPr>
+          <w:p>
+            <w:pPr>
+              <w:jc w:val="center"/>
+            </w:pPr>
+            <w:r>
+              <w:rPr>
+                <w:b/>
+                <w:color w:val="FFFFFF"/>
+                <w:sz w:val="17"/>
+              </w:rPr>
+              <w:t>2025挂牌毛租金收益率</w:t>
+            </w:r>
+          </w:p>
+        </w:tc>
+        <w:tc>
+          <w:tcPr>
+            <w:tcW w:type="dxa" w:w="2948"/>
+            <w:shd w:fill="17365D"/>
+            <w:tcMar>
+              <w:top w:w="90" w:type="dxa"/>
+              <w:start w:w="100" w:type="dxa"/>
+              <w:bottom w:w="90" w:type="dxa"/>
+              <w:end w:w="100" w:type="dxa"/>
+            </w:tcMar>
+            <w:vAlign w:val="center"/>
+          </w:tcPr>
+          <w:p>
+            <w:pPr>
+              <w:jc w:val="center"/>
+            </w:pPr>
+            <w:r>
+              <w:rPr>
+                <w:b/>
+                <w:color w:val="FFFFFF"/>
+                <w:sz w:val="17"/>
+              </w:rPr>
+              <w:t>现金流判断</w:t>
+            </w:r>
+          </w:p>
+        </w:tc>
+        <w:tc>
+          <w:tcPr>
+            <w:tcW w:type="dxa" w:w="2551"/>
+            <w:shd w:fill="17365D"/>
+            <w:tcMar>
+              <w:top w:w="90" w:type="dxa"/>
+              <w:start w:w="100" w:type="dxa"/>
+              <w:bottom w:w="90" w:type="dxa"/>
+              <w:end w:w="100" w:type="dxa"/>
+            </w:tcMar>
+            <w:vAlign w:val="center"/>
+          </w:tcPr>
+          <w:p>
+            <w:pPr>
+              <w:jc w:val="center"/>
+            </w:pPr>
+            <w:r>
+              <w:rPr>
+                <w:b/>
+                <w:color w:val="FFFFFF"/>
+                <w:sz w:val="17"/>
+              </w:rPr>
+              <w:t>投资含义</w:t>
+            </w:r>
+          </w:p>
+        </w:tc>
+      </w:tr>
+      <w:tr>
+        <w:tc>
+          <w:tcPr>
+            <w:tcW w:type="dxa" w:w="1417"/>
+            <w:tcMar>
+              <w:top w:w="90" w:type="dxa"/>
+              <w:start w:w="100" w:type="dxa"/>
+              <w:bottom w:w="90" w:type="dxa"/>
+              <w:end w:w="100" w:type="dxa"/>
+            </w:tcMar>
+            <w:vAlign w:val="center"/>
+          </w:tcPr>
+          <w:p>
+            <w:pPr>
+              <w:spacing w:after="0"/>
+              <w:jc w:val="left"/>
+            </w:pPr>
+            <w:r>
+              <w:rPr>
+                <w:sz w:val="17"/>
+              </w:rPr>
+              <w:t>北京</w:t>
+            </w:r>
+          </w:p>
+        </w:tc>
+        <w:tc>
+          <w:tcPr>
+            <w:tcW w:type="dxa" w:w="2154"/>
+            <w:tcMar>
+              <w:top w:w="90" w:type="dxa"/>
+              <w:start w:w="100" w:type="dxa"/>
+              <w:bottom w:w="90" w:type="dxa"/>
+              <w:end w:w="100" w:type="dxa"/>
+            </w:tcMar>
+            <w:vAlign w:val="center"/>
+          </w:tcPr>
+          <w:p>
+            <w:pPr>
+              <w:spacing w:after="0"/>
+              <w:jc w:val="center"/>
+            </w:pPr>
+            <w:r>
+              <w:rPr>
+                <w:sz w:val="17"/>
+              </w:rPr>
+              <w:t>约2.15%</w:t>
+            </w:r>
+          </w:p>
+        </w:tc>
+        <w:tc>
+          <w:tcPr>
+            <w:tcW w:type="dxa" w:w="2948"/>
+            <w:tcMar>
+              <w:top w:w="90" w:type="dxa"/>
+              <w:start w:w="100" w:type="dxa"/>
+              <w:bottom w:w="90" w:type="dxa"/>
+              <w:end w:w="100" w:type="dxa"/>
+            </w:tcMar>
+            <w:vAlign w:val="center"/>
+          </w:tcPr>
+          <w:p>
+            <w:pPr>
+              <w:spacing w:after="0"/>
+              <w:jc w:val="center"/>
+            </w:pPr>
+            <w:r>
+              <w:rPr>
+                <w:sz w:val="17"/>
+              </w:rPr>
+              <w:t>四城最高但净收益仍偏低</w:t>
+            </w:r>
+          </w:p>
+        </w:tc>
+        <w:tc>
+          <w:tcPr>
+            <w:tcW w:type="dxa" w:w="2551"/>
+            <w:tcMar>
+              <w:top w:w="90" w:type="dxa"/>
+              <w:start w:w="100" w:type="dxa"/>
+              <w:bottom w:w="90" w:type="dxa"/>
+              <w:end w:w="100" w:type="dxa"/>
+            </w:tcMar>
+            <w:vAlign w:val="center"/>
+          </w:tcPr>
+          <w:p>
+            <w:pPr>
+              <w:spacing w:after="0"/>
+              <w:jc w:val="center"/>
+            </w:pPr>
+            <w:r>
+              <w:rPr>
+                <w:sz w:val="17"/>
+              </w:rPr>
+              <w:t>核心保值优于纯租金策略</w:t>
+            </w:r>
+          </w:p>
+        </w:tc>
+      </w:tr>
+      <w:tr>
+        <w:tc>
+          <w:tcPr>
+            <w:tcW w:type="dxa" w:w="1417"/>
+            <w:shd w:fill="F2F4F7"/>
+            <w:tcMar>
+              <w:top w:w="90" w:type="dxa"/>
+              <w:start w:w="100" w:type="dxa"/>
+              <w:bottom w:w="90" w:type="dxa"/>
+              <w:end w:w="100" w:type="dxa"/>
+            </w:tcMar>
+            <w:vAlign w:val="center"/>
+          </w:tcPr>
+          <w:p>
+            <w:pPr>
+              <w:spacing w:after="0"/>
+              <w:jc w:val="left"/>
+            </w:pPr>
+            <w:r>
+              <w:rPr>
+                <w:sz w:val="17"/>
+              </w:rPr>
+              <w:t>上海</w:t>
+            </w:r>
+          </w:p>
+        </w:tc>
+        <w:tc>
+          <w:tcPr>
+            <w:tcW w:type="dxa" w:w="2154"/>
+            <w:shd w:fill="F2F4F7"/>
+            <w:tcMar>
+              <w:top w:w="90" w:type="dxa"/>
+              <w:start w:w="100" w:type="dxa"/>
+              <w:bottom w:w="90" w:type="dxa"/>
+              <w:end w:w="100" w:type="dxa"/>
+            </w:tcMar>
+            <w:vAlign w:val="center"/>
+          </w:tcPr>
+          <w:p>
+            <w:pPr>
+              <w:spacing w:after="0"/>
+              <w:jc w:val="center"/>
+            </w:pPr>
+            <w:r>
+              <w:rPr>
+                <w:sz w:val="17"/>
+              </w:rPr>
+              <w:t>约1.98%</w:t>
+            </w:r>
+          </w:p>
+        </w:tc>
+        <w:tc>
+          <w:tcPr>
+            <w:tcW w:type="dxa" w:w="2948"/>
+            <w:shd w:fill="F2F4F7"/>
+            <w:tcMar>
+              <w:top w:w="90" w:type="dxa"/>
+              <w:start w:w="100" w:type="dxa"/>
+              <w:bottom w:w="90" w:type="dxa"/>
+              <w:end w:w="100" w:type="dxa"/>
+            </w:tcMar>
+            <w:vAlign w:val="center"/>
+          </w:tcPr>
+          <w:p>
+            <w:pPr>
+              <w:spacing w:after="0"/>
+              <w:jc w:val="center"/>
+            </w:pPr>
+            <w:r>
+              <w:rPr>
+                <w:sz w:val="17"/>
+              </w:rPr>
+              <w:t>租赁深度较好、价格基数高</w:t>
+            </w:r>
+          </w:p>
+        </w:tc>
+        <w:tc>
+          <w:tcPr>
+            <w:tcW w:type="dxa" w:w="2551"/>
+            <w:shd w:fill="F2F4F7"/>
+            <w:tcMar>
+              <w:top w:w="90" w:type="dxa"/>
+              <w:start w:w="100" w:type="dxa"/>
+              <w:bottom w:w="90" w:type="dxa"/>
+              <w:end w:w="100" w:type="dxa"/>
+            </w:tcMar>
+            <w:vAlign w:val="center"/>
+          </w:tcPr>
+          <w:p>
+            <w:pPr>
+              <w:spacing w:after="0"/>
+              <w:jc w:val="center"/>
+            </w:pPr>
+            <w:r>
+              <w:rPr>
+                <w:sz w:val="17"/>
+              </w:rPr>
+              <w:t>风险调整后相对均衡</w:t>
+            </w:r>
+          </w:p>
+        </w:tc>
+      </w:tr>
+      <w:tr>
+        <w:tc>
+          <w:tcPr>
+            <w:tcW w:type="dxa" w:w="1417"/>
+            <w:tcMar>
+              <w:top w:w="90" w:type="dxa"/>
+              <w:start w:w="100" w:type="dxa"/>
+              <w:bottom w:w="90" w:type="dxa"/>
+              <w:end w:w="100" w:type="dxa"/>
+            </w:tcMar>
+            <w:vAlign w:val="center"/>
+          </w:tcPr>
+          <w:p>
+            <w:pPr>
+              <w:spacing w:after="0"/>
+              <w:jc w:val="left"/>
+            </w:pPr>
+            <w:r>
+              <w:rPr>
+                <w:sz w:val="17"/>
+              </w:rPr>
+              <w:t>深圳</w:t>
+            </w:r>
+          </w:p>
+        </w:tc>
+        <w:tc>
+          <w:tcPr>
+            <w:tcW w:type="dxa" w:w="2154"/>
+            <w:tcMar>
+              <w:top w:w="90" w:type="dxa"/>
+              <w:start w:w="100" w:type="dxa"/>
+              <w:bottom w:w="90" w:type="dxa"/>
+              <w:end w:w="100" w:type="dxa"/>
+            </w:tcMar>
+            <w:vAlign w:val="center"/>
+          </w:tcPr>
+          <w:p>
+            <w:pPr>
+              <w:spacing w:after="0"/>
+              <w:jc w:val="center"/>
+            </w:pPr>
+            <w:r>
+              <w:rPr>
+                <w:sz w:val="17"/>
+              </w:rPr>
+              <w:t>约1.27%</w:t>
+            </w:r>
+          </w:p>
+        </w:tc>
+        <w:tc>
+          <w:tcPr>
+            <w:tcW w:type="dxa" w:w="2948"/>
+            <w:tcMar>
+              <w:top w:w="90" w:type="dxa"/>
+              <w:start w:w="100" w:type="dxa"/>
+              <w:bottom w:w="90" w:type="dxa"/>
+              <w:end w:w="100" w:type="dxa"/>
+            </w:tcMar>
+            <w:vAlign w:val="center"/>
+          </w:tcPr>
+          <w:p>
+            <w:pPr>
+              <w:spacing w:after="0"/>
+              <w:jc w:val="center"/>
+            </w:pPr>
+            <w:r>
+              <w:rPr>
+                <w:sz w:val="17"/>
+              </w:rPr>
+              <w:t>四城最低，杠杆负现金流风险最高</w:t>
+            </w:r>
+          </w:p>
+        </w:tc>
+        <w:tc>
+          <w:tcPr>
+            <w:tcW w:type="dxa" w:w="2551"/>
+            <w:tcMar>
+              <w:top w:w="90" w:type="dxa"/>
+              <w:start w:w="100" w:type="dxa"/>
+              <w:bottom w:w="90" w:type="dxa"/>
+              <w:end w:w="100" w:type="dxa"/>
+            </w:tcMar>
+            <w:vAlign w:val="center"/>
+          </w:tcPr>
+          <w:p>
+            <w:pPr>
+              <w:spacing w:after="0"/>
+              <w:jc w:val="center"/>
+            </w:pPr>
+            <w:r>
+              <w:rPr>
+                <w:sz w:val="17"/>
+              </w:rPr>
+              <w:t>买入价格与压力测试最重要</w:t>
+            </w:r>
+          </w:p>
+        </w:tc>
+      </w:tr>
+      <w:tr>
+        <w:tc>
+          <w:tcPr>
+            <w:tcW w:type="dxa" w:w="1417"/>
+            <w:shd w:fill="F2F4F7"/>
+            <w:tcMar>
+              <w:top w:w="90" w:type="dxa"/>
+              <w:start w:w="100" w:type="dxa"/>
+              <w:bottom w:w="90" w:type="dxa"/>
+              <w:end w:w="100" w:type="dxa"/>
+            </w:tcMar>
+            <w:vAlign w:val="center"/>
+          </w:tcPr>
+          <w:p>
+            <w:pPr>
+              <w:spacing w:after="0"/>
+              <w:jc w:val="left"/>
+            </w:pPr>
+            <w:r>
+              <w:rPr>
+                <w:sz w:val="17"/>
+              </w:rPr>
+              <w:t>杭州</w:t>
+            </w:r>
+          </w:p>
+        </w:tc>
+        <w:tc>
+          <w:tcPr>
+            <w:tcW w:type="dxa" w:w="2154"/>
+            <w:shd w:fill="F2F4F7"/>
+            <w:tcMar>
+              <w:top w:w="90" w:type="dxa"/>
+              <w:start w:w="100" w:type="dxa"/>
+              <w:bottom w:w="90" w:type="dxa"/>
+              <w:end w:w="100" w:type="dxa"/>
+            </w:tcMar>
+            <w:vAlign w:val="center"/>
+          </w:tcPr>
+          <w:p>
+            <w:pPr>
+              <w:spacing w:after="0"/>
+              <w:jc w:val="center"/>
+            </w:pPr>
+            <w:r>
+              <w:rPr>
+                <w:sz w:val="17"/>
+              </w:rPr>
+              <w:t>约1.72%</w:t>
+            </w:r>
+          </w:p>
+        </w:tc>
+        <w:tc>
+          <w:tcPr>
+            <w:tcW w:type="dxa" w:w="2948"/>
+            <w:shd w:fill="F2F4F7"/>
+            <w:tcMar>
+              <w:top w:w="90" w:type="dxa"/>
+              <w:start w:w="100" w:type="dxa"/>
+              <w:bottom w:w="90" w:type="dxa"/>
+              <w:end w:w="100" w:type="dxa"/>
+            </w:tcMar>
+            <w:vAlign w:val="center"/>
+          </w:tcPr>
+          <w:p>
+            <w:pPr>
+              <w:spacing w:after="0"/>
+              <w:jc w:val="center"/>
+            </w:pPr>
+            <w:r>
+              <w:rPr>
+                <w:sz w:val="17"/>
+              </w:rPr>
+              <w:t>房价调整推动收益率被动改善</w:t>
+            </w:r>
+          </w:p>
+        </w:tc>
+        <w:tc>
+          <w:tcPr>
+            <w:tcW w:type="dxa" w:w="2551"/>
+            <w:shd w:fill="F2F4F7"/>
+            <w:tcMar>
+              <w:top w:w="90" w:type="dxa"/>
+              <w:start w:w="100" w:type="dxa"/>
+              <w:bottom w:w="90" w:type="dxa"/>
+              <w:end w:w="100" w:type="dxa"/>
+            </w:tcMar>
+            <w:vAlign w:val="center"/>
+          </w:tcPr>
+          <w:p>
+            <w:pPr>
+              <w:spacing w:after="0"/>
+              <w:jc w:val="center"/>
+            </w:pPr>
+            <w:r>
+              <w:rPr>
+                <w:sz w:val="17"/>
+              </w:rPr>
+              <w:t>需验证租金而非依赖挂牌报价</w:t>
+            </w:r>
+          </w:p>
+        </w:tc>
+      </w:tr>
+    </w:tbl>
+    <w:p>
+      <w:pPr>
+        <w:spacing w:after="0"/>
+      </w:pPr>
+    </w:p>
+    <w:p>
+      <w:pPr>
+        <w:pStyle w:val="CaptionSource"/>
+      </w:pPr>
+      <w:r>
+        <w:t>注：58安居客2025租赁年报挂牌口径，未扣空置、维修、税费和中介费，不等于可实现净收益率；仅用于同口径横向观察。</w:t>
+      </w:r>
+    </w:p>
+    <w:tbl>
+      <w:tblPr>
+        <w:tblW w:type="auto" w:w="0"/>
+        <w:jc w:val="center"/>
         <w:tblLook w:firstColumn="1" w:firstRow="1" w:lastColumn="0" w:lastRow="0" w:noHBand="0" w:noVBand="1" w:val="04A0"/>
         <w:tblBorders>
           <w:top w:val="single" w:sz="0" w:color="DCEAF7"/>
@@ -13523,7 +14067,80 @@
         <w:pStyle w:val="Heading2"/>
       </w:pPr>
       <w:r>
-        <w:t>6.4 买入、谈判与持有流程</w:t>
+        <w:t>6.4 税费与制度压力测试</w:t>
+      </w:r>
+    </w:p>
+    <w:p>
+      <w:r>
+        <w:t>交易税费应以签约时当地税务机关和购房资格口径为准，不能把当前优惠永久化。现行全国契税优惠按住房套数和140平方米界限区分；自2026年1月1日起，个人出售购买不足2年的住房，按3%征收率全额缴纳增值税，持有满2年免征增值税。模型还应加入“优惠取消、年度持有税增加、出售税费上升”的压力项。</w:t>
+      </w:r>
+    </w:p>
+    <w:p>
+      <w:pPr>
+        <w:pStyle w:val="ListBullet"/>
+        <w:spacing w:after="60"/>
+      </w:pPr>
+      <w:r>
+        <w:rPr>
+          <w:b/>
+        </w:rPr>
+        <w:t>购入端：</w:t>
+      </w:r>
+      <w:r>
+        <w:t>契税、中介费、贷款费用、装修和首期空置全部计入初始投入。</w:t>
+      </w:r>
+    </w:p>
+    <w:p>
+      <w:pPr>
+        <w:pStyle w:val="ListBullet"/>
+        <w:spacing w:after="60"/>
+      </w:pPr>
+      <w:r>
+        <w:rPr>
+          <w:b/>
+        </w:rPr>
+        <w:t>持有端：</w:t>
+      </w:r>
+      <w:r>
+        <w:t>物业、维修、保险、租赁税费及每5—8年的装修资本开支逐项计入。</w:t>
+      </w:r>
+    </w:p>
+    <w:p>
+      <w:pPr>
+        <w:pStyle w:val="ListBullet"/>
+        <w:spacing w:after="60"/>
+      </w:pPr>
+      <w:r>
+        <w:rPr>
+          <w:b/>
+        </w:rPr>
+        <w:t>退出端：</w:t>
+      </w:r>
+      <w:r>
+        <w:t>按保守成交折价、出售中介费和适用税费计算，不用挂牌价作为退出价。</w:t>
+      </w:r>
+    </w:p>
+    <w:p>
+      <w:pPr>
+        <w:pStyle w:val="ListBullet"/>
+        <w:spacing w:after="60"/>
+      </w:pPr>
+      <w:r>
+        <w:rPr>
+          <w:b/>
+        </w:rPr>
+        <w:t>制度风险：</w:t>
+      </w:r>
+      <w:r>
+        <w:t>房地产税改革存在授权框架，但实施城市、时间和税率不能预设；仅作为压力参数。</w:t>
+      </w:r>
+    </w:p>
+    <w:p>
+      <w:pPr>
+        <w:pStyle w:val="Heading2"/>
+      </w:pPr>
+      <w:r>
+        <w:t>6.5 买入、谈判与持有流程</w:t>
       </w:r>
     </w:p>
     <w:p>
@@ -13621,7 +14238,7 @@
         <w:pStyle w:val="Heading2"/>
       </w:pPr>
       <w:r>
-        <w:t>6.5 应回避的高风险品类</w:t>
+        <w:t>6.6 应回避的高风险品类</w:t>
       </w:r>
     </w:p>
     <w:p>
@@ -14823,7 +15440,26 @@
         <w:rPr>
           <w:b/>
         </w:rPr>
-        <w:t>[3] 国家统计局（2026-08-17）《2026年7月份商品住宅销售价格变动情况》解读</w:t>
+        <w:t>[3] 国家统计局2026年1—7月房地产数据（官方内容转载页，2026-08-17）</w:t>
+        <w:br/>
+      </w:r>
+      <w:r>
+        <w:rPr>
+          <w:color w:val="2F75B5"/>
+          <w:sz w:val="16"/>
+        </w:rPr>
+        <w:t>https://zzhz.zjol.com.cn/zjtd/ycbody/ctygrym/202608/t20260817_31854806.shtml</w:t>
+      </w:r>
+    </w:p>
+    <w:p>
+      <w:pPr>
+        <w:spacing w:after="80"/>
+      </w:pPr>
+      <w:r>
+        <w:rPr>
+          <w:b/>
+        </w:rPr>
+        <w:t>[4] 国家统计局（2026-08-17）《2026年7月份商品住宅销售价格变动情况》解读</w:t>
         <w:br/>
       </w:r>
       <w:r>
@@ -14842,7 +15478,7 @@
         <w:rPr>
           <w:b/>
         </w:rPr>
-        <w:t>[4] 国家统计局（2026-02-28）《中华人民共和国2025年国民经济和社会发展统计公报》</w:t>
+        <w:t>[5] 国家统计局（2026-02-28）《中华人民共和国2025年国民经济和社会发展统计公报》</w:t>
         <w:br/>
       </w:r>
       <w:r>
@@ -14861,7 +15497,7 @@
         <w:rPr>
           <w:b/>
         </w:rPr>
-        <w:t>[5] 中国人民银行（2024-05-17）取消全国层面商业性个人住房贷款利率下限</w:t>
+        <w:t>[6] 中国人民银行（2024-05-17）取消全国层面商业性个人住房贷款利率下限</w:t>
         <w:br/>
       </w:r>
       <w:r>
@@ -14880,7 +15516,7 @@
         <w:rPr>
           <w:b/>
         </w:rPr>
-        <w:t>[6] 中国人民银行公告〔2024〕第11号：完善商业性个人住房贷款利率定价机制</w:t>
+        <w:t>[7] 中国人民银行公告〔2024〕第11号：完善商业性个人住房贷款利率定价机制</w:t>
         <w:br/>
       </w:r>
       <w:r>
@@ -14899,7 +15535,7 @@
         <w:rPr>
           <w:b/>
         </w:rPr>
-        <w:t>[7] 中国政府网（2024-06）《3000亿元保障性住房再贷款进展怎样？如何运作？》</w:t>
+        <w:t>[8] 中国政府网（2024-06）《3000亿元保障性住房再贷款进展怎样？如何运作？》</w:t>
         <w:br/>
       </w:r>
       <w:r>
@@ -14918,7 +15554,7 @@
         <w:rPr>
           <w:b/>
         </w:rPr>
-        <w:t>[8] IMF（2026）People’s Republic of China: 2025 Article IV Consultation, Country Report 26/044</w:t>
+        <w:t>[9] IMF（2026）People’s Republic of China: 2025 Article IV Consultation, Country Report 26/044</w:t>
         <w:br/>
       </w:r>
       <w:r>
@@ -14937,7 +15573,7 @@
         <w:rPr>
           <w:b/>
         </w:rPr>
-        <w:t>[9] BIS（2026-05）Residential property price statistics, Q4 2025</w:t>
+        <w:t>[10] BIS（2026-05）Residential property price statistics, Q4 2025</w:t>
         <w:br/>
       </w:r>
       <w:r>
@@ -14956,7 +15592,7 @@
         <w:rPr>
           <w:b/>
         </w:rPr>
-        <w:t>[10] BIS Data Portal — Residential Property Prices</w:t>
+        <w:t>[11] BIS Data Portal — Residential Property Prices</w:t>
         <w:br/>
       </w:r>
       <w:r>
@@ -14975,7 +15611,26 @@
         <w:rPr>
           <w:b/>
         </w:rPr>
-        <w:t>[11] OECD — Housing prices and analytical indicators</w:t>
+        <w:t>[12] 达拉斯联储 — International House Price Database</w:t>
+        <w:br/>
+      </w:r>
+      <w:r>
+        <w:rPr>
+          <w:color w:val="2F75B5"/>
+          <w:sz w:val="16"/>
+        </w:rPr>
+        <w:t>https://www.dallasfed.org/research/international/houseprice</w:t>
+      </w:r>
+    </w:p>
+    <w:p>
+      <w:pPr>
+        <w:spacing w:after="80"/>
+      </w:pPr>
+      <w:r>
+        <w:rPr>
+          <w:b/>
+        </w:rPr>
+        <w:t>[13] OECD — Housing prices and analytical indicators</w:t>
         <w:br/>
       </w:r>
       <w:r>
@@ -14994,7 +15649,7 @@
         <w:rPr>
           <w:b/>
         </w:rPr>
-        <w:t>[12] 日本银行（2012）How to detect and respond to property bubbles</w:t>
+        <w:t>[14] 日本银行（2012）How to detect and respond to property bubbles</w:t>
         <w:br/>
       </w:r>
       <w:r>
@@ -15013,7 +15668,7 @@
         <w:rPr>
           <w:b/>
         </w:rPr>
-        <w:t>[13] 北京市统计局《北京市2025年国民经济和社会发展统计公报》</w:t>
+        <w:t>[15] 北京市统计局《北京市2025年国民经济和社会发展统计公报》</w:t>
         <w:br/>
       </w:r>
       <w:r>
@@ -15032,7 +15687,7 @@
         <w:rPr>
           <w:b/>
         </w:rPr>
-        <w:t>[14] 上海市统计局《2025年上海市国民经济和社会发展统计公报》</w:t>
+        <w:t>[16] 上海市统计局《2025年上海市国民经济和社会发展统计公报》</w:t>
         <w:br/>
       </w:r>
       <w:r>
@@ -15051,7 +15706,7 @@
         <w:rPr>
           <w:b/>
         </w:rPr>
-        <w:t>[15] 深圳市统计局《深圳市2025年国民经济和社会发展统计公报》</w:t>
+        <w:t>[17] 深圳市统计局《深圳市2025年国民经济和社会发展统计公报》</w:t>
         <w:br/>
       </w:r>
       <w:r>
@@ -15070,7 +15725,7 @@
         <w:rPr>
           <w:b/>
         </w:rPr>
-        <w:t>[16] 杭州市统计公报（杭州网转载）《2025年杭州市国民经济和社会发展统计公报》</w:t>
+        <w:t>[18] 杭州市统计公报（杭州网转载）《2025年杭州市国民经济和社会发展统计公报》</w:t>
         <w:br/>
       </w:r>
       <w:r>
@@ -15089,7 +15744,7 @@
         <w:rPr>
           <w:b/>
         </w:rPr>
-        <w:t>[17] 中指研究院（2026-01）2025年重点城市二手住宅成交与价格</w:t>
+        <w:t>[19] 中指研究院（2026-01）2025年重点城市二手住宅成交与价格</w:t>
         <w:br/>
       </w:r>
       <w:r>
@@ -15108,7 +15763,7 @@
         <w:rPr>
           <w:b/>
         </w:rPr>
-        <w:t>[18] 中国房地产指数系统（2026-08）2026年7月十大城市二手房房价地图</w:t>
+        <w:t>[20] 中国房地产指数系统（2026-08）2026年7月十大城市二手房房价地图</w:t>
         <w:br/>
       </w:r>
       <w:r>
@@ -15117,6 +15772,63 @@
           <w:sz w:val="16"/>
         </w:rPr>
         <w:t>http://news.szhome.com/393952.html</w:t>
+      </w:r>
+    </w:p>
+    <w:p>
+      <w:pPr>
+        <w:spacing w:after="80"/>
+      </w:pPr>
+      <w:r>
+        <w:rPr>
+          <w:b/>
+        </w:rPr>
+        <w:t>[21] 58安居客（2025）全国租赁市场年度报告</w:t>
+        <w:br/>
+      </w:r>
+      <w:r>
+        <w:rPr>
+          <w:color w:val="2F75B5"/>
+          <w:sz w:val="16"/>
+        </w:rPr>
+        <w:t>https://pdf.dfcfw.com/pdf/H3_AP202512281809763310_1.pdf?1766932156000.pdf=</w:t>
+      </w:r>
+    </w:p>
+    <w:p>
+      <w:pPr>
+        <w:spacing w:after="80"/>
+      </w:pPr>
+      <w:r>
+        <w:rPr>
+          <w:b/>
+        </w:rPr>
+        <w:t>[22] 财政部等（2024年第16号）房地产交易契税优惠政策</w:t>
+        <w:br/>
+      </w:r>
+      <w:r>
+        <w:rPr>
+          <w:color w:val="2F75B5"/>
+          <w:sz w:val="16"/>
+        </w:rPr>
+        <w:t>https://www.gov.cn/zhengce/zhengceku/202411/content_6986750.htm</w:t>
+      </w:r>
+    </w:p>
+    <w:p>
+      <w:pPr>
+        <w:spacing w:after="80"/>
+      </w:pPr>
+      <w:r>
+        <w:rPr>
+          <w:b/>
+        </w:rPr>
+        <w:t>[23] 国家税务总局：2026年起个人住房销售增值税政策</w:t>
+        <w:br/>
+      </w:r>
+      <w:r>
+        <w:rPr>
+          <w:color w:val="2F75B5"/>
+          <w:sz w:val="16"/>
+        </w:rPr>
+        <w:t>https://fgk.chinatax.gov.cn/zcfgk/c102416/c5246356/content.html</w:t>
       </w:r>
     </w:p>
     <w:p>

</xml_diff>